<commit_message>
Corectură dialog: 'morgen wird besser' → 'morgen wird es besser'
Pronoumele neutru 'es' e necesar ca subiect formal în germană pentru
construcții impersonale cu 'werden + adjectiv comparativ'.

Co-Authored-By: Claude Sonnet 4.6 <noreply@anthropic.com>
</commit_message>
<xml_diff>
--- a/fisa-untrennbare-verben-1.docx
+++ b/fisa-untrennbare-verben-1.docx
@@ -1,5 +1,5 @@
 
-<file path=word/document.xml><?xml version="1.0" encoding="utf-8"?>
+<file path=word\document.xml><?xml version="1.0" encoding="utf-8"?>
 <w:document xmlns:w="http://schemas.openxmlformats.org/wordprocessingml/2006/main">
   <w:body>
     <w:p/>
@@ -1556,7 +1556,7 @@
           <w:szCs w:val="22"/>
           <w:color w:val="000000"/>
         </w:rPr>
-        <w:t xml:space="preserve">Peter: Super! Bis heute Abend. Und keine Sorge — morgen wird besser!</w:t>
+        <w:t xml:space="preserve">Peter: Super! Bis heute Abend. Und keine Sorge — morgen wird es besser!</w:t>
       </w:r>
     </w:p>
     <w:p>

</xml_diff>

<commit_message>
Corecturi exerciții: Sie (ea/pl) ambiguu + posesiv lipsă
- Toate enunțurile cu 'Sie ___' din ex1, ex4, final-test acum
  specifică explicit '(ea)' ca să nu se confunde cu sie/ei-ele plural
  (verb ar fi -en în loc de -t)
- Ex5 #1: traducerea RO 'O vizitez pe bunica' → 'O vizitez pe bunica
  mea' ca să justifice 'meine Oma' din răspunsul corect

Co-Authored-By: Claude Sonnet 4.6 <noreply@anthropic.com>
</commit_message>
<xml_diff>
--- a/fisa-untrennbare-verben-1.docx
+++ b/fisa-untrennbare-verben-1.docx
@@ -1636,7 +1636,7 @@
           <w:szCs w:val="22"/>
           <w:color w:val="000000"/>
         </w:rPr>
-        <w:t xml:space="preserve">2. Sie _______ ein Geschenk. (bekommen)</w:t>
+        <w:t xml:space="preserve">2. Sie (ea) _______ ein Geschenk. (bekommen)</w:t>
       </w:r>
     </w:p>
     <w:p>
@@ -1713,7 +1713,7 @@
           <w:szCs w:val="22"/>
           <w:color w:val="000000"/>
         </w:rPr>
-        <w:t xml:space="preserve">9. Sie _______ sich für den blauen Pullover. (sich entscheiden)</w:t>
+        <w:t xml:space="preserve">9. Sie (ea) _______ sich für den blauen Pullover. (sich entscheiden)</w:t>
       </w:r>
     </w:p>
     <w:p>
@@ -2066,7 +2066,7 @@
           <w:szCs w:val="22"/>
           <w:color w:val="000000"/>
         </w:rPr>
-        <w:t xml:space="preserve">4. Sie _______ sich an die schöne Reise. (își amintește)</w:t>
+        <w:t xml:space="preserve">4. Sie (ea) _______ sich an die schöne Reise. (își amintește)</w:t>
       </w:r>
     </w:p>
     <w:p>
@@ -2136,7 +2136,7 @@
           <w:szCs w:val="22"/>
           <w:color w:val="000000"/>
         </w:rPr>
-        <w:t xml:space="preserve">1. O vizitez pe bunica. → _____________________________</w:t>
+        <w:t xml:space="preserve">1. O vizitez pe bunica mea. → _____________________________</w:t>
       </w:r>
     </w:p>
     <w:p>
@@ -2850,7 +2850,7 @@
           <w:szCs w:val="22"/>
           <w:color w:val="000000"/>
         </w:rPr>
-        <w:t xml:space="preserve">12. Sie _______ sich an dich. (sich erinnern)</w:t>
+        <w:t xml:space="preserve">12. Sie (ea) _______ sich an dich. (sich erinnern)</w:t>
       </w:r>
     </w:p>
     <w:p>

</xml_diff>